<commit_message>
UK Swiss Norway space legislation
</commit_message>
<xml_diff>
--- a/01_POLICY/Member States/Index _01Policy_Member States.docx
+++ b/01_POLICY/Member States/Index _01Policy_Member States.docx
@@ -12,12 +12,273 @@
         <w:rPr>
           <w:lang w:val="en-US"/>
         </w:rPr>
+        <w:t>Croatia</w:t>
+      </w:r>
+    </w:p>
+    <w:p>
+      <w:pPr>
+        <w:rPr>
+          <w:lang w:val="en-US"/>
+        </w:rPr>
+      </w:pPr>
+      <w:r>
+        <w:t>National Space Strategy – in preparation, expected 2026”,</w:t>
+      </w:r>
+    </w:p>
+    <w:p>
+      <w:pPr>
+        <w:rPr>
+          <w:lang w:val="en-US"/>
+        </w:rPr>
+      </w:pPr>
+      <w:r>
+        <w:rPr>
+          <w:lang w:val="en-US"/>
+        </w:rPr>
+        <w:t>Bulgaria</w:t>
+      </w:r>
+    </w:p>
+    <w:p>
+      <w:pPr>
+        <w:rPr>
+          <w:lang w:val="en-US"/>
+        </w:rPr>
+      </w:pPr>
+      <w:r>
+        <w:rPr>
+          <w:lang w:val="en-US"/>
+        </w:rPr>
+        <w:t>SPACE POLICY - Ministry of Innovation and Growth</w:t>
+      </w:r>
+    </w:p>
+    <w:p>
+      <w:pPr>
+        <w:rPr>
+          <w:lang w:val="en-US"/>
+        </w:rPr>
+      </w:pPr>
+      <w:r>
+        <w:rPr>
+          <w:lang w:val="en-US"/>
+        </w:rPr>
+        <w:t>Greece</w:t>
+      </w:r>
+    </w:p>
+    <w:p>
+      <w:r>
+        <w:t>Structure of the New National Space Program (HELLAS-SPACE 2.0)</w:t>
+      </w:r>
+    </w:p>
+    <w:p>
+      <w:r>
+        <w:t>Romania</w:t>
+      </w:r>
+    </w:p>
+    <w:p>
+      <w:pPr>
+        <w:rPr>
+          <w:lang w:val="it-IT"/>
+        </w:rPr>
+      </w:pPr>
+      <w:r>
+        <w:rPr>
+          <w:lang w:val="it-IT"/>
+        </w:rPr>
+        <w:t>Strategia spațială – ROSA – Romanian Space Agency</w:t>
+      </w:r>
+    </w:p>
+    <w:p>
+      <w:pPr>
+        <w:rPr>
+          <w:lang w:val="it-IT"/>
+        </w:rPr>
+      </w:pPr>
+      <w:r>
+        <w:rPr>
+          <w:lang w:val="it-IT"/>
+        </w:rPr>
+        <w:t>Slovakia</w:t>
+      </w:r>
+    </w:p>
+    <w:tbl>
+      <w:tblPr>
+        <w:tblW w:w="0" w:type="auto"/>
+        <w:tblCellSpacing w:w="15" w:type="dxa"/>
+        <w:tblCellMar>
+          <w:top w:w="15" w:type="dxa"/>
+          <w:left w:w="15" w:type="dxa"/>
+          <w:bottom w:w="15" w:type="dxa"/>
+          <w:right w:w="15" w:type="dxa"/>
+        </w:tblCellMar>
+        <w:tblLook w:val="04A0" w:firstRow="1" w:lastRow="0" w:firstColumn="1" w:lastColumn="0" w:noHBand="0" w:noVBand="1"/>
+      </w:tblPr>
+      <w:tblGrid>
+        <w:gridCol w:w="96"/>
+      </w:tblGrid>
+      <w:tr>
+        <w:trPr>
+          <w:tblCellSpacing w:w="15" w:type="dxa"/>
+        </w:trPr>
+        <w:tc>
+          <w:tcPr>
+            <w:tcW w:w="0" w:type="auto"/>
+            <w:vAlign w:val="center"/>
+            <w:hideMark/>
+          </w:tcPr>
+          <w:p/>
+        </w:tc>
+      </w:tr>
+    </w:tbl>
+    <w:p>
+      <w:pPr>
+        <w:rPr>
+          <w:vanish/>
+        </w:rPr>
+      </w:pPr>
+    </w:p>
+    <w:tbl>
+      <w:tblPr>
+        <w:tblW w:w="0" w:type="auto"/>
+        <w:tblCellSpacing w:w="15" w:type="dxa"/>
+        <w:tblCellMar>
+          <w:top w:w="15" w:type="dxa"/>
+          <w:left w:w="15" w:type="dxa"/>
+          <w:bottom w:w="15" w:type="dxa"/>
+          <w:right w:w="15" w:type="dxa"/>
+        </w:tblCellMar>
+        <w:tblLook w:val="04A0" w:firstRow="1" w:lastRow="0" w:firstColumn="1" w:lastColumn="0" w:noHBand="0" w:noVBand="1"/>
+      </w:tblPr>
+      <w:tblGrid>
+        <w:gridCol w:w="9026"/>
+      </w:tblGrid>
+      <w:tr>
+        <w:trPr>
+          <w:tblCellSpacing w:w="15" w:type="dxa"/>
+        </w:trPr>
+        <w:tc>
+          <w:tcPr>
+            <w:tcW w:w="0" w:type="auto"/>
+            <w:vAlign w:val="center"/>
+            <w:hideMark/>
+          </w:tcPr>
+          <w:p>
+            <w:proofErr w:type="spellStart"/>
+            <w:r>
+              <w:t>Vesmírna</w:t>
+            </w:r>
+            <w:proofErr w:type="spellEnd"/>
+            <w:r>
+              <w:t xml:space="preserve"> </w:t>
+            </w:r>
+            <w:proofErr w:type="spellStart"/>
+            <w:r>
+              <w:t>stratégia</w:t>
+            </w:r>
+            <w:proofErr w:type="spellEnd"/>
+            <w:r>
+              <w:t xml:space="preserve"> SR 2030+ – </w:t>
+            </w:r>
+            <w:proofErr w:type="spellStart"/>
+            <w:r>
+              <w:t>Vesmír</w:t>
+            </w:r>
+            <w:proofErr w:type="spellEnd"/>
+            <w:r>
+              <w:t xml:space="preserve"> </w:t>
+            </w:r>
+            <w:proofErr w:type="spellStart"/>
+            <w:r>
+              <w:t>ako</w:t>
+            </w:r>
+            <w:proofErr w:type="spellEnd"/>
+            <w:r>
+              <w:t xml:space="preserve"> motor </w:t>
+            </w:r>
+            <w:proofErr w:type="spellStart"/>
+            <w:r>
+              <w:t>rastu</w:t>
+            </w:r>
+            <w:proofErr w:type="spellEnd"/>
+            <w:r>
+              <w:t xml:space="preserve"> / Space Strategy of the Slovak Republic 2030+ – Space as an Engine of Growth</w:t>
+            </w:r>
+          </w:p>
+        </w:tc>
+      </w:tr>
+    </w:tbl>
+    <w:p>
+      <w:r>
+        <w:t>Spain</w:t>
+      </w:r>
+    </w:p>
+    <w:p>
+      <w:pPr>
+        <w:rPr>
+          <w:lang w:val="it-IT"/>
+        </w:rPr>
+      </w:pPr>
+      <w:r>
+        <w:rPr>
+          <w:lang w:val="it-IT"/>
+        </w:rPr>
+        <w:t>BOLETÍN OFICIAL DEL ESTADO Núm. 187 Martes 5 de agosto de 2025 Sec. III. Pág. 105613 III. OTRAS DISPOSICIONES MINISTERIO DE LA PRESIDENCIA, JUSTICIA Y RELACIONES CON LAS CORTES</w:t>
+      </w:r>
+    </w:p>
+    <w:p>
+      <w:pPr>
+        <w:rPr>
+          <w:lang w:val="en-US"/>
+        </w:rPr>
+      </w:pPr>
+      <w:r>
+        <w:rPr>
+          <w:lang w:val="en-US"/>
+        </w:rPr>
+        <w:t>Belgium</w:t>
+      </w:r>
+    </w:p>
+    <w:p>
+      <w:r>
+        <w:t>Belgian space strategy</w:t>
+      </w:r>
+    </w:p>
+    <w:p>
+      <w:pPr>
+        <w:rPr>
+          <w:lang w:val="en-US"/>
+        </w:rPr>
+      </w:pPr>
+      <w:r>
+        <w:rPr>
+          <w:lang w:val="en-US"/>
+        </w:rPr>
         <w:t>Czech Republic</w:t>
       </w:r>
     </w:p>
     <w:p>
-      <w:r>
-        <w:t xml:space="preserve">Národní kosmický plán 2026 – 2032 </w:t>
+      <w:proofErr w:type="spellStart"/>
+      <w:r>
+        <w:t>Národní</w:t>
+      </w:r>
+      <w:proofErr w:type="spellEnd"/>
+      <w:r>
+        <w:t xml:space="preserve"> </w:t>
+      </w:r>
+      <w:proofErr w:type="spellStart"/>
+      <w:r>
+        <w:t>kosmický</w:t>
+      </w:r>
+      <w:proofErr w:type="spellEnd"/>
+      <w:r>
+        <w:t xml:space="preserve"> </w:t>
+      </w:r>
+      <w:proofErr w:type="spellStart"/>
+      <w:r>
+        <w:t>plán</w:t>
+      </w:r>
+      <w:proofErr w:type="spellEnd"/>
+      <w:r>
+        <w:t xml:space="preserve"> 2026 – 2032 </w:t>
       </w:r>
     </w:p>
     <w:p>
@@ -32,10 +293,7 @@
     </w:p>
     <w:p>
       <w:r>
-        <w:t>Cyprus Space Strategy 2025-2030</w:t>
-      </w:r>
-      <w:r>
-        <w:t xml:space="preserve"> </w:t>
+        <w:t xml:space="preserve">Cyprus Space Strategy 2025-2030 </w:t>
       </w:r>
       <w:r>
         <w:t xml:space="preserve">( </w:t>
@@ -69,8 +327,9 @@
         <w:br/>
         <w:t>space strategy</w:t>
       </w:r>
-    </w:p>
-    <w:p>
+      <w:r>
+        <w:t xml:space="preserve"> </w:t>
+      </w:r>
       <w:r>
         <w:t>Update of strategic objectives</w:t>
       </w:r>
@@ -80,10 +339,63 @@
     </w:p>
     <w:p>
       <w:r>
-        <w:t>S</w:t>
-      </w:r>
-      <w:r>
-        <w:t>trategi for rumforskning og -innovation Nationale prioriteter for dansk rumforskning, innovation og teknologiudvikling 2025-2035 November 2024</w:t>
+        <w:t xml:space="preserve">Strategi for </w:t>
+      </w:r>
+      <w:proofErr w:type="spellStart"/>
+      <w:r>
+        <w:t>rumforskning</w:t>
+      </w:r>
+      <w:proofErr w:type="spellEnd"/>
+      <w:r>
+        <w:t xml:space="preserve"> </w:t>
+      </w:r>
+      <w:proofErr w:type="spellStart"/>
+      <w:r>
+        <w:t>og</w:t>
+      </w:r>
+      <w:proofErr w:type="spellEnd"/>
+      <w:r>
+        <w:t xml:space="preserve"> -innovation Nationale </w:t>
+      </w:r>
+      <w:proofErr w:type="spellStart"/>
+      <w:r>
+        <w:t>prioriteter</w:t>
+      </w:r>
+      <w:proofErr w:type="spellEnd"/>
+      <w:r>
+        <w:t xml:space="preserve"> for </w:t>
+      </w:r>
+      <w:proofErr w:type="spellStart"/>
+      <w:r>
+        <w:t>dansk</w:t>
+      </w:r>
+      <w:proofErr w:type="spellEnd"/>
+      <w:r>
+        <w:t xml:space="preserve"> </w:t>
+      </w:r>
+      <w:proofErr w:type="spellStart"/>
+      <w:r>
+        <w:t>rumforskning</w:t>
+      </w:r>
+      <w:proofErr w:type="spellEnd"/>
+      <w:r>
+        <w:t xml:space="preserve">, innovation </w:t>
+      </w:r>
+      <w:proofErr w:type="spellStart"/>
+      <w:r>
+        <w:t>og</w:t>
+      </w:r>
+      <w:proofErr w:type="spellEnd"/>
+      <w:r>
+        <w:t xml:space="preserve"> </w:t>
+      </w:r>
+      <w:proofErr w:type="spellStart"/>
+      <w:r>
+        <w:t>teknologiudvikling</w:t>
+      </w:r>
+      <w:proofErr w:type="spellEnd"/>
+      <w:r>
+        <w:t xml:space="preserve"> 2025-2035 November 2024</w:t>
       </w:r>
     </w:p>
     <w:p>
@@ -96,12 +408,34 @@
         <w:rPr>
           <w:lang w:val="en-US"/>
         </w:rPr>
+        <w:lastRenderedPageBreak/>
         <w:t>Latvia</w:t>
       </w:r>
     </w:p>
     <w:p>
-      <w:r>
-        <w:t>Latvijas kosmosa stratēģija 2021.–2027. Gadam</w:t>
+      <w:proofErr w:type="spellStart"/>
+      <w:r>
+        <w:t>Latvijas</w:t>
+      </w:r>
+      <w:proofErr w:type="spellEnd"/>
+      <w:r>
+        <w:t xml:space="preserve"> </w:t>
+      </w:r>
+      <w:proofErr w:type="spellStart"/>
+      <w:r>
+        <w:t>kosmosa</w:t>
+      </w:r>
+      <w:proofErr w:type="spellEnd"/>
+      <w:r>
+        <w:t xml:space="preserve"> </w:t>
+      </w:r>
+      <w:proofErr w:type="spellStart"/>
+      <w:r>
+        <w:t>stratēģija</w:t>
+      </w:r>
+      <w:proofErr w:type="spellEnd"/>
+      <w:r>
+        <w:t xml:space="preserve"> 2021.–2027. Gadam</w:t>
       </w:r>
     </w:p>
     <w:p>
@@ -136,8 +470,93 @@
     </w:p>
     <w:p>
       <w:r>
-        <w:t>Program działań na rzecz rozwoju technologii kosmicznych i wykorzystywania systemów satelitarnych w Polsce</w:t>
-      </w:r>
+        <w:t xml:space="preserve">Program </w:t>
+      </w:r>
+      <w:proofErr w:type="spellStart"/>
+      <w:r>
+        <w:t>działań</w:t>
+      </w:r>
+      <w:proofErr w:type="spellEnd"/>
+      <w:r>
+        <w:t xml:space="preserve"> </w:t>
+      </w:r>
+      <w:proofErr w:type="spellStart"/>
+      <w:r>
+        <w:t>na</w:t>
+      </w:r>
+      <w:proofErr w:type="spellEnd"/>
+      <w:r>
+        <w:t xml:space="preserve"> </w:t>
+      </w:r>
+      <w:proofErr w:type="spellStart"/>
+      <w:r>
+        <w:t>rzecz</w:t>
+      </w:r>
+      <w:proofErr w:type="spellEnd"/>
+      <w:r>
+        <w:t xml:space="preserve"> </w:t>
+      </w:r>
+      <w:proofErr w:type="spellStart"/>
+      <w:r>
+        <w:t>rozwoju</w:t>
+      </w:r>
+      <w:proofErr w:type="spellEnd"/>
+      <w:r>
+        <w:t xml:space="preserve"> </w:t>
+      </w:r>
+      <w:proofErr w:type="spellStart"/>
+      <w:r>
+        <w:t>technologii</w:t>
+      </w:r>
+      <w:proofErr w:type="spellEnd"/>
+      <w:r>
+        <w:t xml:space="preserve"> </w:t>
+      </w:r>
+      <w:proofErr w:type="spellStart"/>
+      <w:r>
+        <w:t>kosmicznych</w:t>
+      </w:r>
+      <w:proofErr w:type="spellEnd"/>
+      <w:r>
+        <w:t xml:space="preserve"> </w:t>
+      </w:r>
+      <w:proofErr w:type="spellStart"/>
+      <w:r>
+        <w:t>i</w:t>
+      </w:r>
+      <w:proofErr w:type="spellEnd"/>
+      <w:r>
+        <w:t xml:space="preserve"> </w:t>
+      </w:r>
+      <w:proofErr w:type="spellStart"/>
+      <w:r>
+        <w:t>wykorzystywania</w:t>
+      </w:r>
+      <w:proofErr w:type="spellEnd"/>
+      <w:r>
+        <w:t xml:space="preserve"> </w:t>
+      </w:r>
+      <w:proofErr w:type="spellStart"/>
+      <w:r>
+        <w:t>systemów</w:t>
+      </w:r>
+      <w:proofErr w:type="spellEnd"/>
+      <w:r>
+        <w:t xml:space="preserve"> </w:t>
+      </w:r>
+      <w:proofErr w:type="spellStart"/>
+      <w:r>
+        <w:t>satelitarnych</w:t>
+      </w:r>
+      <w:proofErr w:type="spellEnd"/>
+      <w:r>
+        <w:t xml:space="preserve"> w </w:t>
+      </w:r>
+      <w:proofErr w:type="spellStart"/>
+      <w:r>
+        <w:t>Polsce</w:t>
+      </w:r>
+      <w:proofErr w:type="spellEnd"/>
     </w:p>
     <w:p>
       <w:pPr>
@@ -210,7 +629,6 @@
         <w:rPr>
           <w:lang w:val="it-IT"/>
         </w:rPr>
-        <w:lastRenderedPageBreak/>
         <w:t>Mensch, Klima, Wirtschaft:</w:t>
       </w:r>
       <w:r>
@@ -310,9 +728,36 @@
       </w:r>
     </w:p>
     <w:p>
-      <w:r>
-        <w:t>Regeringens skrivelse 2017/18:259 En strategi för svensk rymdverksamhet</w:t>
-      </w:r>
+      <w:proofErr w:type="spellStart"/>
+      <w:r>
+        <w:lastRenderedPageBreak/>
+        <w:t>Regeringens</w:t>
+      </w:r>
+      <w:proofErr w:type="spellEnd"/>
+      <w:r>
+        <w:t xml:space="preserve"> </w:t>
+      </w:r>
+      <w:proofErr w:type="spellStart"/>
+      <w:r>
+        <w:t>skrivelse</w:t>
+      </w:r>
+      <w:proofErr w:type="spellEnd"/>
+      <w:r>
+        <w:t xml:space="preserve"> 2017/18:259 En strategi för </w:t>
+      </w:r>
+      <w:proofErr w:type="spellStart"/>
+      <w:r>
+        <w:t>svensk</w:t>
+      </w:r>
+      <w:proofErr w:type="spellEnd"/>
+      <w:r>
+        <w:t xml:space="preserve"> </w:t>
+      </w:r>
+      <w:proofErr w:type="spellStart"/>
+      <w:r>
+        <w:t>rymdverksamhet</w:t>
+      </w:r>
+      <w:proofErr w:type="spellEnd"/>
     </w:p>
     <w:p>
       <w:pPr>
@@ -390,13 +835,50 @@
       </w:r>
     </w:p>
     <w:p>
-      <w:r>
-        <w:t>Kamerbrief ruimtevaartbeleid 2022</w:t>
-      </w:r>
-    </w:p>
-    <w:p>
-      <w:r>
-        <w:t>NSO Advies voor het ruimtevaartbeleid 2023-2025</w:t>
+      <w:proofErr w:type="spellStart"/>
+      <w:r>
+        <w:t>Kamerbrief</w:t>
+      </w:r>
+      <w:proofErr w:type="spellEnd"/>
+      <w:r>
+        <w:t xml:space="preserve"> </w:t>
+      </w:r>
+      <w:proofErr w:type="spellStart"/>
+      <w:r>
+        <w:t>ruimtevaartbeleid</w:t>
+      </w:r>
+      <w:proofErr w:type="spellEnd"/>
+      <w:r>
+        <w:t xml:space="preserve"> 2022</w:t>
+      </w:r>
+    </w:p>
+    <w:p>
+      <w:r>
+        <w:t xml:space="preserve">NSO </w:t>
+      </w:r>
+      <w:proofErr w:type="spellStart"/>
+      <w:r>
+        <w:t>Advies</w:t>
+      </w:r>
+      <w:proofErr w:type="spellEnd"/>
+      <w:r>
+        <w:t xml:space="preserve"> </w:t>
+      </w:r>
+      <w:proofErr w:type="spellStart"/>
+      <w:r>
+        <w:t>voor</w:t>
+      </w:r>
+      <w:proofErr w:type="spellEnd"/>
+      <w:r>
+        <w:t xml:space="preserve"> het </w:t>
+      </w:r>
+      <w:proofErr w:type="spellStart"/>
+      <w:r>
+        <w:t>ruimtevaartbeleid</w:t>
+      </w:r>
+      <w:proofErr w:type="spellEnd"/>
+      <w:r>
+        <w:t xml:space="preserve"> 2023-2025</w:t>
       </w:r>
     </w:p>
     <w:p>
@@ -451,7 +933,6 @@
     </w:p>
     <w:p>
       <w:r>
-        <w:lastRenderedPageBreak/>
         <w:t>Malta</w:t>
       </w:r>
     </w:p>
@@ -481,8 +962,61 @@
     </w:p>
     <w:p>
       <w:r>
-        <w:t>Meld. St. 10 (2019 – 2020) Melding til Stortinget Høytflyvende satellitter – jordnære formål En strategi for norsk romvirksomhet</w:t>
-      </w:r>
+        <w:t xml:space="preserve">Meld. St. 10 (2019 – 2020) Melding </w:t>
+      </w:r>
+      <w:proofErr w:type="spellStart"/>
+      <w:r>
+        <w:t>til</w:t>
+      </w:r>
+      <w:proofErr w:type="spellEnd"/>
+      <w:r>
+        <w:t xml:space="preserve"> Stortinget </w:t>
+      </w:r>
+      <w:proofErr w:type="spellStart"/>
+      <w:r>
+        <w:t>Høytflyvende</w:t>
+      </w:r>
+      <w:proofErr w:type="spellEnd"/>
+      <w:r>
+        <w:t xml:space="preserve"> </w:t>
+      </w:r>
+      <w:proofErr w:type="spellStart"/>
+      <w:r>
+        <w:t>satellitter</w:t>
+      </w:r>
+      <w:proofErr w:type="spellEnd"/>
+      <w:r>
+        <w:t xml:space="preserve"> – </w:t>
+      </w:r>
+      <w:proofErr w:type="spellStart"/>
+      <w:r>
+        <w:t>jordnære</w:t>
+      </w:r>
+      <w:proofErr w:type="spellEnd"/>
+      <w:r>
+        <w:t xml:space="preserve"> </w:t>
+      </w:r>
+      <w:proofErr w:type="spellStart"/>
+      <w:r>
+        <w:t>formål</w:t>
+      </w:r>
+      <w:proofErr w:type="spellEnd"/>
+      <w:r>
+        <w:t xml:space="preserve"> En strategi for </w:t>
+      </w:r>
+      <w:proofErr w:type="spellStart"/>
+      <w:r>
+        <w:t>norsk</w:t>
+      </w:r>
+      <w:proofErr w:type="spellEnd"/>
+      <w:r>
+        <w:t xml:space="preserve"> </w:t>
+      </w:r>
+      <w:proofErr w:type="spellStart"/>
+      <w:r>
+        <w:t>romvirksomhet</w:t>
+      </w:r>
+      <w:proofErr w:type="spellEnd"/>
     </w:p>
     <w:p>
       <w:r>
@@ -509,15 +1043,15 @@
     </w:p>
     <w:p>
       <w:r>
-        <w:t>National Space Strategy</w:t>
-      </w:r>
-      <w:r>
-        <w:t xml:space="preserve"> in action July 2023 </w:t>
-      </w:r>
-    </w:p>
-    <w:p>
-      <w:r>
-        <w:t>Defence Space Strategy: Operationalising the Space Domain February 2022</w:t>
+        <w:t xml:space="preserve">National Space Strategy in action July 2023 </w:t>
+      </w:r>
+    </w:p>
+    <w:p>
+      <w:r>
+        <w:t>Defence Space Str</w:t>
+      </w:r>
+      <w:r>
+        <w:t>ategy: Operationalising the Space Domain February 2022</w:t>
       </w:r>
     </w:p>
     <w:sectPr>

</xml_diff>